<commit_message>
Finalizado Banco de Dados
</commit_message>
<xml_diff>
--- a/Banco de Dados/Trabalho 02/Sistema para Empresa de Agenciamento de Mão.docx
+++ b/Banco de Dados/Trabalho 02/Sistema para Empresa de Agenciamento de Mão.docx
@@ -1,6 +1,6 @@
 
 <file path=word/document.xml><?xml version="1.0" encoding="utf-8"?>
-<w:document xmlns:wpc="http://schemas.microsoft.com/office/word/2010/wordprocessingCanvas" xmlns:cx="http://schemas.microsoft.com/office/drawing/2014/chartex" xmlns:cx1="http://schemas.microsoft.com/office/drawing/2015/9/8/chartex" xmlns:mc="http://schemas.openxmlformats.org/markup-compatibility/2006" xmlns:o="urn:schemas-microsoft-com:office:office" xmlns:r="http://schemas.openxmlformats.org/officeDocument/2006/relationships" xmlns:m="http://schemas.openxmlformats.org/officeDocument/2006/math" xmlns:v="urn:schemas-microsoft-com:vml" xmlns:wp14="http://schemas.microsoft.com/office/word/2010/wordprocessingDrawing" xmlns:wp="http://schemas.openxmlformats.org/drawingml/2006/wordprocessingDrawing" xmlns:w10="urn:schemas-microsoft-com:office:word" xmlns:w="http://schemas.openxmlformats.org/wordprocessingml/2006/main" xmlns:w14="http://schemas.microsoft.com/office/word/2010/wordml" xmlns:w15="http://schemas.microsoft.com/office/word/2012/wordml" xmlns:w16se="http://schemas.microsoft.com/office/word/2015/wordml/symex" xmlns:wpg="http://schemas.microsoft.com/office/word/2010/wordprocessingGroup" xmlns:wpi="http://schemas.microsoft.com/office/word/2010/wordprocessingInk" xmlns:wne="http://schemas.microsoft.com/office/word/2006/wordml" xmlns:wps="http://schemas.microsoft.com/office/word/2010/wordprocessingShape" mc:Ignorable="w14 w15 w16se wp14">
+<w:document xmlns:wpc="http://schemas.microsoft.com/office/word/2010/wordprocessingCanvas" xmlns:cx="http://schemas.microsoft.com/office/drawing/2014/chartex" xmlns:cx1="http://schemas.microsoft.com/office/drawing/2015/9/8/chartex" xmlns:cx2="http://schemas.microsoft.com/office/drawing/2015/10/21/chartex" xmlns:cx3="http://schemas.microsoft.com/office/drawing/2016/5/9/chartex" xmlns:cx4="http://schemas.microsoft.com/office/drawing/2016/5/10/chartex" xmlns:cx5="http://schemas.microsoft.com/office/drawing/2016/5/11/chartex" xmlns:cx6="http://schemas.microsoft.com/office/drawing/2016/5/12/chartex" xmlns:cx7="http://schemas.microsoft.com/office/drawing/2016/5/13/chartex" xmlns:cx8="http://schemas.microsoft.com/office/drawing/2016/5/14/chartex" xmlns:mc="http://schemas.openxmlformats.org/markup-compatibility/2006" xmlns:aink="http://schemas.microsoft.com/office/drawing/2016/ink" xmlns:am3d="http://schemas.microsoft.com/office/drawing/2017/model3d" xmlns:o="urn:schemas-microsoft-com:office:office" xmlns:r="http://schemas.openxmlformats.org/officeDocument/2006/relationships" xmlns:m="http://schemas.openxmlformats.org/officeDocument/2006/math" xmlns:v="urn:schemas-microsoft-com:vml" xmlns:wp14="http://schemas.microsoft.com/office/word/2010/wordprocessingDrawing" xmlns:wp="http://schemas.openxmlformats.org/drawingml/2006/wordprocessingDrawing" xmlns:w10="urn:schemas-microsoft-com:office:word" xmlns:w="http://schemas.openxmlformats.org/wordprocessingml/2006/main" xmlns:w14="http://schemas.microsoft.com/office/word/2010/wordml" xmlns:w15="http://schemas.microsoft.com/office/word/2012/wordml" xmlns:w16cid="http://schemas.microsoft.com/office/word/2016/wordml/cid" xmlns:w16se="http://schemas.microsoft.com/office/word/2015/wordml/symex" xmlns:wpg="http://schemas.microsoft.com/office/word/2010/wordprocessingGroup" xmlns:wpi="http://schemas.microsoft.com/office/word/2010/wordprocessingInk" xmlns:wne="http://schemas.microsoft.com/office/word/2006/wordml" xmlns:wps="http://schemas.microsoft.com/office/word/2010/wordprocessingShape" mc:Ignorable="w14 w15 w16se w16cid wp14">
   <w:body>
     <w:p>
       <w:pPr>
@@ -359,6 +359,572 @@
         </w:rPr>
         <w:t>contendo vários candidatos ou várias empresas.</w:t>
       </w:r>
+    </w:p>
+    <w:p>
+      <w:pPr>
+        <w:ind w:firstLine="708"/>
+        <w:rPr>
+          <w:rFonts w:ascii="Arial" w:hAnsi="Arial" w:cs="Arial"/>
+          <w:sz w:val="24"/>
+          <w:szCs w:val="28"/>
+        </w:rPr>
+      </w:pPr>
+    </w:p>
+    <w:p>
+      <w:pPr>
+        <w:ind w:firstLine="708"/>
+        <w:rPr>
+          <w:rFonts w:ascii="Arial" w:hAnsi="Arial" w:cs="Arial"/>
+          <w:sz w:val="24"/>
+          <w:szCs w:val="28"/>
+        </w:rPr>
+      </w:pPr>
+      <w:r>
+        <w:rPr>
+          <w:rFonts w:ascii="Arial" w:hAnsi="Arial" w:cs="Arial"/>
+          <w:sz w:val="24"/>
+          <w:szCs w:val="28"/>
+        </w:rPr>
+        <w:t>1º Passo</w:t>
+      </w:r>
+      <w:r>
+        <w:rPr>
+          <w:rFonts w:ascii="Arial" w:hAnsi="Arial" w:cs="Arial"/>
+          <w:sz w:val="24"/>
+          <w:szCs w:val="28"/>
+        </w:rPr>
+        <w:br/>
+      </w:r>
+      <w:r>
+        <w:rPr>
+          <w:rFonts w:ascii="Arial" w:hAnsi="Arial" w:cs="Arial"/>
+          <w:sz w:val="24"/>
+          <w:szCs w:val="28"/>
+        </w:rPr>
+        <w:t xml:space="preserve">Identificar todos os substantivos que designem </w:t>
+      </w:r>
+      <w:r>
+        <w:rPr>
+          <w:rFonts w:ascii="Arial" w:hAnsi="Arial" w:cs="Arial"/>
+          <w:sz w:val="24"/>
+          <w:szCs w:val="28"/>
+        </w:rPr>
+        <w:t>entidades</w:t>
+      </w:r>
+      <w:r>
+        <w:rPr>
+          <w:rFonts w:ascii="Arial" w:hAnsi="Arial" w:cs="Arial"/>
+          <w:sz w:val="24"/>
+          <w:szCs w:val="28"/>
+        </w:rPr>
+        <w:t xml:space="preserve">: </w:t>
+      </w:r>
+    </w:p>
+    <w:p>
+      <w:pPr>
+        <w:ind w:firstLine="708"/>
+        <w:rPr>
+          <w:rFonts w:ascii="Arial" w:hAnsi="Arial" w:cs="Arial"/>
+          <w:sz w:val="24"/>
+          <w:szCs w:val="28"/>
+        </w:rPr>
+      </w:pPr>
+      <w:r>
+        <w:rPr>
+          <w:rFonts w:ascii="Arial" w:hAnsi="Arial" w:cs="Arial"/>
+          <w:sz w:val="24"/>
+          <w:szCs w:val="28"/>
+        </w:rPr>
+        <w:t>Empresa de agenciamento de mão-de-obra, candidatos, emprego, sistema, dados cadastrais, empresas, vagas, contratos, nome, CPF, endereço, telefones, e-mail, data de nascimento, profissão, CNPJ, nome do responsável, número do contrato, data da contratação, valor do salário</w:t>
+      </w:r>
+    </w:p>
+    <w:p>
+      <w:pPr>
+        <w:ind w:firstLine="708"/>
+        <w:rPr>
+          <w:rFonts w:ascii="Arial" w:hAnsi="Arial" w:cs="Arial"/>
+          <w:sz w:val="24"/>
+          <w:szCs w:val="28"/>
+        </w:rPr>
+      </w:pPr>
+    </w:p>
+    <w:p>
+      <w:pPr>
+        <w:ind w:firstLine="708"/>
+        <w:rPr>
+          <w:rFonts w:ascii="Arial" w:hAnsi="Arial" w:cs="Arial"/>
+          <w:sz w:val="24"/>
+          <w:szCs w:val="28"/>
+        </w:rPr>
+      </w:pPr>
+      <w:r>
+        <w:rPr>
+          <w:rFonts w:ascii="Arial" w:hAnsi="Arial" w:cs="Arial"/>
+          <w:sz w:val="24"/>
+          <w:szCs w:val="28"/>
+        </w:rPr>
+        <w:t>2º Passo</w:t>
+      </w:r>
+      <w:r>
+        <w:rPr>
+          <w:rFonts w:ascii="Arial" w:hAnsi="Arial" w:cs="Arial"/>
+          <w:sz w:val="24"/>
+          <w:szCs w:val="28"/>
+        </w:rPr>
+        <w:br/>
+      </w:r>
+      <w:r>
+        <w:rPr>
+          <w:rFonts w:ascii="Arial" w:hAnsi="Arial" w:cs="Arial"/>
+          <w:sz w:val="24"/>
+          <w:szCs w:val="28"/>
+        </w:rPr>
+        <w:t>Descartar entidades de ocorrência única: Empresa de agenciamento e sistema</w:t>
+      </w:r>
+    </w:p>
+    <w:p>
+      <w:pPr>
+        <w:ind w:firstLine="708"/>
+        <w:rPr>
+          <w:rFonts w:ascii="Arial" w:hAnsi="Arial" w:cs="Arial"/>
+          <w:sz w:val="24"/>
+          <w:szCs w:val="28"/>
+        </w:rPr>
+      </w:pPr>
+      <w:r>
+        <w:rPr>
+          <w:rFonts w:ascii="Arial" w:hAnsi="Arial" w:cs="Arial"/>
+          <w:sz w:val="24"/>
+          <w:szCs w:val="28"/>
+        </w:rPr>
+        <w:t>3º Pass</w:t>
+      </w:r>
+      <w:r>
+        <w:rPr>
+          <w:rFonts w:ascii="Arial" w:hAnsi="Arial" w:cs="Arial"/>
+          <w:sz w:val="24"/>
+          <w:szCs w:val="28"/>
+        </w:rPr>
+        <w:t>o</w:t>
+      </w:r>
+      <w:r>
+        <w:rPr>
+          <w:rFonts w:ascii="Arial" w:hAnsi="Arial" w:cs="Arial"/>
+          <w:sz w:val="24"/>
+          <w:szCs w:val="28"/>
+        </w:rPr>
+        <w:br/>
+      </w:r>
+      <w:r>
+        <w:rPr>
+          <w:rFonts w:ascii="Arial" w:hAnsi="Arial" w:cs="Arial"/>
+          <w:sz w:val="24"/>
+          <w:szCs w:val="28"/>
+        </w:rPr>
+        <w:t>Descartar substantivos de entendimento do problema: Emprego, dados cadastrais e vagas</w:t>
+      </w:r>
+    </w:p>
+    <w:p>
+      <w:pPr>
+        <w:ind w:firstLine="708"/>
+        <w:rPr>
+          <w:rFonts w:ascii="Arial" w:hAnsi="Arial" w:cs="Arial"/>
+          <w:sz w:val="24"/>
+          <w:szCs w:val="28"/>
+        </w:rPr>
+      </w:pPr>
+      <w:r>
+        <w:rPr>
+          <w:rFonts w:ascii="Arial" w:hAnsi="Arial" w:cs="Arial"/>
+          <w:sz w:val="24"/>
+          <w:szCs w:val="28"/>
+        </w:rPr>
+        <w:t>4º Passo</w:t>
+      </w:r>
+      <w:r>
+        <w:rPr>
+          <w:rFonts w:ascii="Arial" w:hAnsi="Arial" w:cs="Arial"/>
+          <w:sz w:val="24"/>
+          <w:szCs w:val="28"/>
+        </w:rPr>
+        <w:br/>
+      </w:r>
+      <w:r>
+        <w:rPr>
+          <w:rFonts w:ascii="Arial" w:hAnsi="Arial" w:cs="Arial"/>
+          <w:sz w:val="24"/>
+          <w:szCs w:val="28"/>
+        </w:rPr>
+        <w:t xml:space="preserve">Descartar referências a funcionalidades futuras: Não </w:t>
+      </w:r>
+      <w:r>
+        <w:rPr>
+          <w:rFonts w:ascii="Arial" w:hAnsi="Arial" w:cs="Arial"/>
+          <w:sz w:val="24"/>
+          <w:szCs w:val="28"/>
+        </w:rPr>
+        <w:t>tem</w:t>
+      </w:r>
+    </w:p>
+    <w:p>
+      <w:pPr>
+        <w:ind w:firstLine="708"/>
+        <w:rPr>
+          <w:rFonts w:ascii="Arial" w:hAnsi="Arial" w:cs="Arial"/>
+          <w:sz w:val="24"/>
+          <w:szCs w:val="28"/>
+        </w:rPr>
+      </w:pPr>
+      <w:r>
+        <w:rPr>
+          <w:rFonts w:ascii="Arial" w:hAnsi="Arial" w:cs="Arial"/>
+          <w:sz w:val="24"/>
+          <w:szCs w:val="28"/>
+        </w:rPr>
+        <w:t>.</w:t>
+      </w:r>
+    </w:p>
+    <w:p>
+      <w:pPr>
+        <w:ind w:firstLine="708"/>
+        <w:rPr>
+          <w:rFonts w:ascii="Arial" w:hAnsi="Arial" w:cs="Arial"/>
+          <w:sz w:val="24"/>
+          <w:szCs w:val="28"/>
+        </w:rPr>
+      </w:pPr>
+    </w:p>
+    <w:p>
+      <w:pPr>
+        <w:ind w:firstLine="708"/>
+        <w:rPr>
+          <w:rFonts w:ascii="Arial" w:hAnsi="Arial" w:cs="Arial"/>
+          <w:sz w:val="24"/>
+          <w:szCs w:val="28"/>
+        </w:rPr>
+      </w:pPr>
+      <w:r>
+        <w:rPr>
+          <w:rFonts w:ascii="Arial" w:hAnsi="Arial" w:cs="Arial"/>
+          <w:sz w:val="24"/>
+          <w:szCs w:val="28"/>
+        </w:rPr>
+        <w:lastRenderedPageBreak/>
+        <w:t>5º Passo</w:t>
+      </w:r>
+      <w:r>
+        <w:rPr>
+          <w:rFonts w:ascii="Arial" w:hAnsi="Arial" w:cs="Arial"/>
+          <w:sz w:val="24"/>
+          <w:szCs w:val="28"/>
+        </w:rPr>
+        <w:br/>
+      </w:r>
+      <w:r>
+        <w:rPr>
+          <w:rFonts w:ascii="Arial" w:hAnsi="Arial" w:cs="Arial"/>
+          <w:sz w:val="24"/>
+          <w:szCs w:val="28"/>
+        </w:rPr>
+        <w:t xml:space="preserve">Listar as </w:t>
+      </w:r>
+      <w:r>
+        <w:rPr>
+          <w:rFonts w:ascii="Arial" w:hAnsi="Arial" w:cs="Arial"/>
+          <w:sz w:val="24"/>
+          <w:szCs w:val="28"/>
+        </w:rPr>
+        <w:t>entidades</w:t>
+      </w:r>
+      <w:r>
+        <w:rPr>
+          <w:rFonts w:ascii="Arial" w:hAnsi="Arial" w:cs="Arial"/>
+          <w:sz w:val="24"/>
+          <w:szCs w:val="28"/>
+        </w:rPr>
+        <w:t xml:space="preserve"> finais: Candidato, Empresa e Contrato</w:t>
+      </w:r>
+    </w:p>
+    <w:p>
+      <w:pPr>
+        <w:ind w:firstLine="708"/>
+        <w:rPr>
+          <w:rFonts w:ascii="Arial" w:hAnsi="Arial" w:cs="Arial"/>
+          <w:sz w:val="24"/>
+          <w:szCs w:val="28"/>
+        </w:rPr>
+      </w:pPr>
+      <w:r>
+        <w:rPr>
+          <w:rFonts w:ascii="Arial" w:hAnsi="Arial" w:cs="Arial"/>
+          <w:sz w:val="24"/>
+          <w:szCs w:val="28"/>
+        </w:rPr>
+        <w:t>6º Passo</w:t>
+      </w:r>
+      <w:r>
+        <w:rPr>
+          <w:rFonts w:ascii="Arial" w:hAnsi="Arial" w:cs="Arial"/>
+          <w:sz w:val="24"/>
+          <w:szCs w:val="28"/>
+        </w:rPr>
+        <w:br/>
+        <w:t>I</w:t>
+      </w:r>
+      <w:r>
+        <w:rPr>
+          <w:rFonts w:ascii="Arial" w:hAnsi="Arial" w:cs="Arial"/>
+          <w:sz w:val="24"/>
+          <w:szCs w:val="28"/>
+        </w:rPr>
+        <w:t xml:space="preserve">dentificar </w:t>
+      </w:r>
+      <w:r>
+        <w:rPr>
+          <w:rFonts w:ascii="Arial" w:hAnsi="Arial" w:cs="Arial"/>
+          <w:sz w:val="24"/>
+          <w:szCs w:val="28"/>
+        </w:rPr>
+        <w:t>relacionamentos</w:t>
+      </w:r>
+      <w:r>
+        <w:rPr>
+          <w:rFonts w:ascii="Arial" w:hAnsi="Arial" w:cs="Arial"/>
+          <w:sz w:val="24"/>
+          <w:szCs w:val="28"/>
+        </w:rPr>
+        <w:t xml:space="preserve"> e cardinalidade:</w:t>
+      </w:r>
+    </w:p>
+    <w:p>
+      <w:pPr>
+        <w:ind w:firstLine="708"/>
+        <w:rPr>
+          <w:rFonts w:ascii="Arial" w:hAnsi="Arial" w:cs="Arial"/>
+          <w:sz w:val="24"/>
+          <w:szCs w:val="28"/>
+        </w:rPr>
+      </w:pPr>
+      <w:r>
+        <w:rPr>
+          <w:rFonts w:ascii="Arial" w:hAnsi="Arial" w:cs="Arial"/>
+          <w:sz w:val="24"/>
+          <w:szCs w:val="28"/>
+        </w:rPr>
+        <w:t>Empresa x Contrato: Uma empresa pode firmar diversos contratos, mas cada contrato individual é vinculado a apenas uma empresa</w:t>
+      </w:r>
+    </w:p>
+    <w:p>
+      <w:pPr>
+        <w:ind w:firstLine="708"/>
+        <w:rPr>
+          <w:rFonts w:ascii="Arial" w:hAnsi="Arial" w:cs="Arial"/>
+          <w:sz w:val="24"/>
+          <w:szCs w:val="28"/>
+        </w:rPr>
+      </w:pPr>
+      <w:r>
+        <w:rPr>
+          <w:rFonts w:ascii="Arial" w:hAnsi="Arial" w:cs="Arial"/>
+          <w:sz w:val="24"/>
+          <w:szCs w:val="28"/>
+        </w:rPr>
+        <w:t>Candidato x Contrato: Um candidato pode ter diversos contratos (com diferentes empresas), mas cada contrato individual pertence a apenas um candidato</w:t>
+      </w:r>
+    </w:p>
+    <w:p>
+      <w:pPr>
+        <w:ind w:firstLine="708"/>
+        <w:rPr>
+          <w:rFonts w:ascii="Arial" w:hAnsi="Arial" w:cs="Arial"/>
+          <w:sz w:val="24"/>
+          <w:szCs w:val="28"/>
+        </w:rPr>
+      </w:pPr>
+      <w:r>
+        <w:rPr>
+          <w:rFonts w:ascii="Arial" w:hAnsi="Arial" w:cs="Arial"/>
+          <w:sz w:val="24"/>
+          <w:szCs w:val="28"/>
+        </w:rPr>
+        <w:t>O relacionamento de Candidato x Empresa é feito pela própria entidade Contrato.</w:t>
+      </w:r>
+    </w:p>
+    <w:p>
+      <w:pPr>
+        <w:ind w:firstLine="708"/>
+        <w:rPr>
+          <w:rFonts w:ascii="Arial" w:hAnsi="Arial" w:cs="Arial"/>
+          <w:sz w:val="24"/>
+          <w:szCs w:val="28"/>
+        </w:rPr>
+      </w:pPr>
+      <w:r>
+        <w:rPr>
+          <w:rFonts w:ascii="Arial" w:hAnsi="Arial" w:cs="Arial"/>
+          <w:sz w:val="24"/>
+          <w:szCs w:val="28"/>
+        </w:rPr>
+        <w:t>7º Passo</w:t>
+      </w:r>
+      <w:r>
+        <w:rPr>
+          <w:rFonts w:ascii="Arial" w:hAnsi="Arial" w:cs="Arial"/>
+          <w:sz w:val="24"/>
+          <w:szCs w:val="28"/>
+        </w:rPr>
+        <w:br/>
+      </w:r>
+      <w:r>
+        <w:rPr>
+          <w:rFonts w:ascii="Arial" w:hAnsi="Arial" w:cs="Arial"/>
+          <w:sz w:val="24"/>
+          <w:szCs w:val="28"/>
+        </w:rPr>
+        <w:t xml:space="preserve">Identificar </w:t>
+      </w:r>
+      <w:r>
+        <w:rPr>
+          <w:rFonts w:ascii="Arial" w:hAnsi="Arial" w:cs="Arial"/>
+          <w:sz w:val="24"/>
+          <w:szCs w:val="28"/>
+        </w:rPr>
+        <w:t>atributos</w:t>
+      </w:r>
+      <w:r>
+        <w:rPr>
+          <w:rFonts w:ascii="Arial" w:hAnsi="Arial" w:cs="Arial"/>
+          <w:sz w:val="24"/>
+          <w:szCs w:val="28"/>
+        </w:rPr>
+        <w:t>:</w:t>
+      </w:r>
+    </w:p>
+    <w:p>
+      <w:pPr>
+        <w:ind w:firstLine="708"/>
+        <w:rPr>
+          <w:rFonts w:ascii="Arial" w:hAnsi="Arial" w:cs="Arial"/>
+          <w:sz w:val="24"/>
+          <w:szCs w:val="28"/>
+        </w:rPr>
+      </w:pPr>
+      <w:r>
+        <w:rPr>
+          <w:rFonts w:ascii="Arial" w:hAnsi="Arial" w:cs="Arial"/>
+          <w:sz w:val="24"/>
+          <w:szCs w:val="28"/>
+        </w:rPr>
+        <w:t>Candidato: CPF (ID), nome, endereço, telefones, e-mail, data de nascimento e profissão</w:t>
+      </w:r>
+    </w:p>
+    <w:p>
+      <w:pPr>
+        <w:ind w:firstLine="708"/>
+        <w:rPr>
+          <w:rFonts w:ascii="Arial" w:hAnsi="Arial" w:cs="Arial"/>
+          <w:sz w:val="24"/>
+          <w:szCs w:val="28"/>
+        </w:rPr>
+      </w:pPr>
+      <w:r>
+        <w:rPr>
+          <w:rFonts w:ascii="Arial" w:hAnsi="Arial" w:cs="Arial"/>
+          <w:sz w:val="24"/>
+          <w:szCs w:val="28"/>
+        </w:rPr>
+        <w:t>Empresa: CNPJ (ID), nome do responsável, telefones, e-mail e endereço</w:t>
+      </w:r>
+    </w:p>
+    <w:p>
+      <w:pPr>
+        <w:ind w:firstLine="708"/>
+        <w:rPr>
+          <w:rFonts w:ascii="Arial" w:hAnsi="Arial" w:cs="Arial"/>
+          <w:sz w:val="24"/>
+          <w:szCs w:val="28"/>
+        </w:rPr>
+      </w:pPr>
+      <w:r>
+        <w:rPr>
+          <w:rFonts w:ascii="Arial" w:hAnsi="Arial" w:cs="Arial"/>
+          <w:sz w:val="24"/>
+          <w:szCs w:val="28"/>
+        </w:rPr>
+        <w:drawing>
+          <wp:anchor distT="0" distB="0" distL="114300" distR="114300" simplePos="0" relativeHeight="251658240" behindDoc="0" locked="0" layoutInCell="1" allowOverlap="1" wp14:anchorId="6999E946">
+            <wp:simplePos x="0" y="0"/>
+            <wp:positionH relativeFrom="column">
+              <wp:posOffset>-1080135</wp:posOffset>
+            </wp:positionH>
+            <wp:positionV relativeFrom="paragraph">
+              <wp:posOffset>290830</wp:posOffset>
+            </wp:positionV>
+            <wp:extent cx="7753344" cy="2705100"/>
+            <wp:effectExtent l="0" t="0" r="635" b="0"/>
+            <wp:wrapNone/>
+            <wp:docPr id="1" name="Imagem 1"/>
+            <wp:cNvGraphicFramePr>
+              <a:graphicFrameLocks xmlns:a="http://schemas.openxmlformats.org/drawingml/2006/main" noChangeAspect="1"/>
+            </wp:cNvGraphicFramePr>
+            <a:graphic xmlns:a="http://schemas.openxmlformats.org/drawingml/2006/main">
+              <a:graphicData uri="http://schemas.openxmlformats.org/drawingml/2006/picture">
+                <pic:pic xmlns:pic="http://schemas.openxmlformats.org/drawingml/2006/picture">
+                  <pic:nvPicPr>
+                    <pic:cNvPr id="1" name=""/>
+                    <pic:cNvPicPr/>
+                  </pic:nvPicPr>
+                  <pic:blipFill>
+                    <a:blip r:embed="rId4">
+                      <a:extLst>
+                        <a:ext uri="{28A0092B-C50C-407E-A947-70E740481C1C}">
+                          <a14:useLocalDpi xmlns:a14="http://schemas.microsoft.com/office/drawing/2010/main" val="0"/>
+                        </a:ext>
+                      </a:extLst>
+                    </a:blip>
+                    <a:stretch>
+                      <a:fillRect/>
+                    </a:stretch>
+                  </pic:blipFill>
+                  <pic:spPr>
+                    <a:xfrm>
+                      <a:off x="0" y="0"/>
+                      <a:ext cx="7773435" cy="2712110"/>
+                    </a:xfrm>
+                    <a:prstGeom prst="rect">
+                      <a:avLst/>
+                    </a:prstGeom>
+                  </pic:spPr>
+                </pic:pic>
+              </a:graphicData>
+            </a:graphic>
+            <wp14:sizeRelH relativeFrom="margin">
+              <wp14:pctWidth>0</wp14:pctWidth>
+            </wp14:sizeRelH>
+            <wp14:sizeRelV relativeFrom="margin">
+              <wp14:pctHeight>0</wp14:pctHeight>
+            </wp14:sizeRelV>
+          </wp:anchor>
+        </w:drawing>
+      </w:r>
+      <w:r>
+        <w:rPr>
+          <w:rFonts w:ascii="Arial" w:hAnsi="Arial" w:cs="Arial"/>
+          <w:sz w:val="24"/>
+          <w:szCs w:val="28"/>
+        </w:rPr>
+        <w:t>Contrato: Número do contrato (ID), data da contratação e valor do salário</w:t>
+      </w:r>
+    </w:p>
+    <w:p>
+      <w:pPr>
+        <w:ind w:firstLine="708"/>
+        <w:rPr>
+          <w:rFonts w:ascii="Arial" w:hAnsi="Arial" w:cs="Arial"/>
+          <w:sz w:val="24"/>
+          <w:szCs w:val="28"/>
+        </w:rPr>
+      </w:pPr>
       <w:bookmarkStart w:id="0" w:name="_GoBack"/>
       <w:bookmarkEnd w:id="0"/>
     </w:p>
@@ -373,7 +939,7 @@
 </file>
 
 <file path=word/styles.xml><?xml version="1.0" encoding="utf-8"?>
-<w:styles xmlns:mc="http://schemas.openxmlformats.org/markup-compatibility/2006" xmlns:r="http://schemas.openxmlformats.org/officeDocument/2006/relationships" xmlns:w="http://schemas.openxmlformats.org/wordprocessingml/2006/main" xmlns:w14="http://schemas.microsoft.com/office/word/2010/wordml" xmlns:w15="http://schemas.microsoft.com/office/word/2012/wordml" xmlns:w16se="http://schemas.microsoft.com/office/word/2015/wordml/symex" mc:Ignorable="w14 w15 w16se">
+<w:styles xmlns:mc="http://schemas.openxmlformats.org/markup-compatibility/2006" xmlns:r="http://schemas.openxmlformats.org/officeDocument/2006/relationships" xmlns:w="http://schemas.openxmlformats.org/wordprocessingml/2006/main" xmlns:w14="http://schemas.microsoft.com/office/word/2010/wordml" xmlns:w15="http://schemas.microsoft.com/office/word/2012/wordml" xmlns:w16cid="http://schemas.microsoft.com/office/word/2016/wordml/cid" xmlns:w16se="http://schemas.microsoft.com/office/word/2015/wordml/symex" mc:Ignorable="w14 w15 w16se w16cid">
   <w:docDefaults>
     <w:rPrDefault>
       <w:rPr>
@@ -389,7 +955,7 @@
       </w:pPr>
     </w:pPrDefault>
   </w:docDefaults>
-  <w:latentStyles w:defLockedState="0" w:defUIPriority="99" w:defSemiHidden="0" w:defUnhideWhenUsed="0" w:defQFormat="0" w:count="371">
+  <w:latentStyles w:defLockedState="0" w:defUIPriority="99" w:defSemiHidden="0" w:defUnhideWhenUsed="0" w:defQFormat="0" w:count="375">
     <w:lsdException w:name="Normal" w:uiPriority="0" w:qFormat="1"/>
     <w:lsdException w:name="heading 1" w:uiPriority="9" w:qFormat="1"/>
     <w:lsdException w:name="heading 2" w:semiHidden="1" w:uiPriority="9" w:unhideWhenUsed="1" w:qFormat="1"/>
@@ -495,7 +1061,6 @@
     <w:lsdException w:name="HTML Sample" w:semiHidden="1" w:unhideWhenUsed="1"/>
     <w:lsdException w:name="HTML Typewriter" w:semiHidden="1" w:unhideWhenUsed="1"/>
     <w:lsdException w:name="HTML Variable" w:semiHidden="1" w:unhideWhenUsed="1"/>
-    <w:lsdException w:name="Normal Table" w:semiHidden="1" w:unhideWhenUsed="1"/>
     <w:lsdException w:name="annotation subject" w:semiHidden="1" w:unhideWhenUsed="1"/>
     <w:lsdException w:name="No List" w:semiHidden="1" w:unhideWhenUsed="1"/>
     <w:lsdException w:name="Outline List 1" w:semiHidden="1" w:unhideWhenUsed="1"/>
@@ -539,10 +1104,8 @@
     <w:lsdException w:name="Table Elegant" w:semiHidden="1" w:unhideWhenUsed="1"/>
     <w:lsdException w:name="Table Professional" w:semiHidden="1" w:unhideWhenUsed="1"/>
     <w:lsdException w:name="Table Subtle 1" w:semiHidden="1" w:unhideWhenUsed="1"/>
-    <w:lsdException w:name="Table Subtle 2" w:semiHidden="1" w:unhideWhenUsed="1"/>
     <w:lsdException w:name="Table Web 1" w:semiHidden="1" w:unhideWhenUsed="1"/>
     <w:lsdException w:name="Table Web 2" w:semiHidden="1" w:unhideWhenUsed="1"/>
-    <w:lsdException w:name="Table Web 3" w:semiHidden="1" w:unhideWhenUsed="1"/>
     <w:lsdException w:name="Balloon Text" w:semiHidden="1" w:unhideWhenUsed="1"/>
     <w:lsdException w:name="Table Grid" w:uiPriority="39"/>
     <w:lsdException w:name="Table Theme" w:semiHidden="1" w:unhideWhenUsed="1"/>
@@ -761,6 +1324,10 @@
     <w:lsdException w:name="List Table 5 Dark Accent 6" w:uiPriority="50"/>
     <w:lsdException w:name="List Table 6 Colorful Accent 6" w:uiPriority="51"/>
     <w:lsdException w:name="List Table 7 Colorful Accent 6" w:uiPriority="52"/>
+    <w:lsdException w:name="Mention" w:semiHidden="1" w:unhideWhenUsed="1"/>
+    <w:lsdException w:name="Smart Hyperlink" w:semiHidden="1" w:unhideWhenUsed="1"/>
+    <w:lsdException w:name="Hashtag" w:semiHidden="1" w:unhideWhenUsed="1"/>
+    <w:lsdException w:name="Unresolved Mention" w:semiHidden="1" w:unhideWhenUsed="1"/>
   </w:latentStyles>
   <w:style w:type="paragraph" w:default="1" w:styleId="Normal">
     <w:name w:val="Normal"/>

</xml_diff>